<commit_message>
chore: scrub sample party data from contract template
</commit_message>
<xml_diff>
--- a/packages/backend/assets/contract-supply-shelly.docx
+++ b/packages/backend/assets/contract-supply-shelly.docx
@@ -2652,7 +2652,7 @@
                 <w:sz w:val="20"/>
                 <w:szCs w:val="20"/>
               </w:rPr>
-              <w:t>Генеральный директор</w:t>
+              <w:t>{{CONTRACTOR_SIGNATURE}}</w:t>
             </w:r>
             <w:r>
               <w:rPr>
@@ -2661,7 +2661,7 @@
                 <w:szCs w:val="20"/>
               </w:rPr>
               <w:br/>
-              <w:t>_____________/ Забоев Г.А. /</w:t>
+              <w:t/>
             </w:r>
             <w:r>
               <w:rPr>
@@ -2670,7 +2670,7 @@
                 <w:szCs w:val="20"/>
               </w:rPr>
               <w:br/>
-              <w:t>М.П.</w:t>
+              <w:t/>
             </w:r>
           </w:p>
         </w:tc>
@@ -2695,7 +2695,7 @@
                 <w:sz w:val="20"/>
                 <w:szCs w:val="20"/>
               </w:rPr>
-              <w:t>Генеральный директор</w:t>
+              <w:t>{{CUSTOMER_SIGNATURE}}</w:t>
             </w:r>
             <w:r>
               <w:rPr>
@@ -2704,7 +2704,7 @@
                 <w:szCs w:val="20"/>
               </w:rPr>
               <w:br/>
-              <w:t>_____________/ Чернов Е.Н. /</w:t>
+              <w:t/>
             </w:r>
             <w:r>
               <w:rPr>
@@ -2713,7 +2713,7 @@
                 <w:szCs w:val="20"/>
               </w:rPr>
               <w:br/>
-              <w:t>М.П.</w:t>
+              <w:t/>
             </w:r>
           </w:p>
         </w:tc>
@@ -4008,7 +4008,7 @@
                 <w:sz w:val="20"/>
                 <w:szCs w:val="20"/>
               </w:rPr>
-              <w:t>Генеральный директор</w:t>
+              <w:t>{{CONTRACTOR_SIGNATURE}}</w:t>
             </w:r>
             <w:r>
               <w:rPr>
@@ -4017,7 +4017,7 @@
                 <w:szCs w:val="20"/>
               </w:rPr>
               <w:br/>
-              <w:t>_____________/ Забоев Г.А. /</w:t>
+              <w:t/>
             </w:r>
             <w:r>
               <w:rPr>
@@ -4026,7 +4026,7 @@
                 <w:szCs w:val="20"/>
               </w:rPr>
               <w:br/>
-              <w:t>М.П.</w:t>
+              <w:t/>
             </w:r>
           </w:p>
         </w:tc>
@@ -4051,7 +4051,7 @@
                 <w:sz w:val="20"/>
                 <w:szCs w:val="20"/>
               </w:rPr>
-              <w:t>Генеральный директор</w:t>
+              <w:t>{{CUSTOMER_SIGNATURE}}</w:t>
             </w:r>
             <w:r>
               <w:rPr>
@@ -4060,7 +4060,7 @@
                 <w:szCs w:val="20"/>
               </w:rPr>
               <w:br/>
-              <w:t>_____________/ Чернов Е.Н. /</w:t>
+              <w:t/>
             </w:r>
             <w:r>
               <w:rPr>
@@ -4069,7 +4069,7 @@
                 <w:szCs w:val="20"/>
               </w:rPr>
               <w:br/>
-              <w:t>М.П.</w:t>
+              <w:t/>
             </w:r>
           </w:p>
         </w:tc>

</xml_diff>

<commit_message>
fix: replace Shelly supply contract terms
</commit_message>
<xml_diff>
--- a/packages/backend/assets/contract-supply-shelly.docx
+++ b/packages/backend/assets/contract-supply-shelly.docx
@@ -632,6 +632,21 @@
       </w:pPr>
       <w:r>
         <w:t>5.3.3. в момент сдачи Поставщиком Товара в терминал транспортной компании, привлеченной Покупателем.</w:t>
+      </w:r>
+    </w:p>
+    <w:p>
+      <w:pPr>
+        <w:spacing w:after="0"/>
+        <w:jc w:val="both"/>
+        <w:rPr>
+          <w:lang w:val="ru-RU"/>
+        </w:rPr>
+      </w:pPr>
+      <w:r>
+        <w:rPr>
+          <w:lang w:val="ru-RU"/>
+        </w:rPr>
+        <w:t>5.3.4. Передача Товара Покупателю, в том числе при самовывозе, передаче перевозчику, транспортной компании либо иному уполномоченному Покупателем лицу, осуществляется только после поступления 100% оплаты стоимости соответствующей партии Товара на расчетный счет Поставщика, если иной порядок оплаты и передачи Товара прямо не установлен соответствующей Спецификацией к настоящему Договору.</w:t>
       </w:r>
     </w:p>
     <w:p>
@@ -3686,6 +3701,28 @@
     <w:p>
       <w:pPr>
         <w:numPr>
+          <w:ilvl w:val="1"/>
+          <w:numId w:val="12"/>
+        </w:numPr>
+        <w:spacing w:after="0" w:line="240" w:lineRule="auto"/>
+        <w:ind w:left="786"/>
+        <w:textAlignment w:val="baseline"/>
+        <w:rPr>
+          <w:rFonts w:cs="Times New Roman"/>
+          <w:color w:val="000000"/>
+          <w:lang w:val="ru-RU" w:eastAsia="ru-RU"/>
+        </w:rPr>
+      </w:pPr>
+      <w:r>
+        <w:rPr>
+          <w:lang w:val="ru-RU"/>
+        </w:rPr>
+        <w:t>Оставшиеся {{SUPPLY_BALANCE_PERCENT}}% стоимости оборудования оплачиваются Покупателем непосредственно перед передачей Товара Покупателю. Передача Товара допускается только после поступления указанной оплаты на расчетный счет Поставщика.</w:t>
+      </w:r>
+    </w:p>
+    <w:p>
+      <w:pPr>
+        <w:numPr>
           <w:ilvl w:val="0"/>
           <w:numId w:val="15"/>
         </w:numPr>

</xml_diff>